<commit_message>
Ajout de l'url de notre repos
</commit_message>
<xml_diff>
--- a/TP2-GSG_KR/TP 2 GIT H26.docx
+++ b/TP2-GSG_KR/TP 2 GIT H26.docx
@@ -337,7 +337,7 @@
     </w:p>
     <w:p>
       <w:pPr>
-        <w:pStyle w:val="ListParagraph"/>
+        <w:pStyle w:val="Paragraphedeliste"/>
         <w:numPr>
           <w:ilvl w:val="0"/>
           <w:numId w:val="13"/>
@@ -360,7 +360,7 @@
     </w:p>
     <w:p>
       <w:pPr>
-        <w:pStyle w:val="ListParagraph"/>
+        <w:pStyle w:val="Paragraphedeliste"/>
         <w:numPr>
           <w:ilvl w:val="0"/>
           <w:numId w:val="13"/>
@@ -390,7 +390,7 @@
     </w:p>
     <w:p>
       <w:pPr>
-        <w:pStyle w:val="ListParagraph"/>
+        <w:pStyle w:val="Paragraphedeliste"/>
         <w:numPr>
           <w:ilvl w:val="0"/>
           <w:numId w:val="13"/>
@@ -441,7 +441,7 @@
     </w:p>
     <w:p>
       <w:pPr>
-        <w:pStyle w:val="ListParagraph"/>
+        <w:pStyle w:val="Paragraphedeliste"/>
         <w:numPr>
           <w:ilvl w:val="0"/>
           <w:numId w:val="13"/>
@@ -464,7 +464,7 @@
     </w:p>
     <w:p>
       <w:pPr>
-        <w:pStyle w:val="ListParagraph"/>
+        <w:pStyle w:val="Paragraphedeliste"/>
         <w:tabs>
           <w:tab w:val="left" w:pos="851"/>
         </w:tabs>
@@ -752,7 +752,7 @@
     </w:p>
     <w:p>
       <w:pPr>
-        <w:pStyle w:val="Heading2"/>
+        <w:pStyle w:val="Titre2"/>
         <w:ind w:firstLine="360"/>
         <w:rPr>
           <w:sz w:val="24"/>
@@ -869,7 +869,7 @@
     </w:p>
     <w:tbl>
       <w:tblPr>
-        <w:tblStyle w:val="TableGrid"/>
+        <w:tblStyle w:val="Grilledutableau"/>
         <w:tblW w:w="0" w:type="auto"/>
         <w:tblInd w:w="360" w:type="dxa"/>
         <w:tblLook w:val="04A0" w:firstRow="1" w:lastRow="0" w:firstColumn="1" w:lastColumn="0" w:noHBand="0" w:noVBand="1"/>
@@ -902,6 +902,9 @@
                 <w:numId w:val="0"/>
               </w:numPr>
             </w:pPr>
+            <w:r>
+              <w:t>https://github.com/rkwibe/TP2-GSG_KR.git</w:t>
+            </w:r>
           </w:p>
           <w:p>
             <w:pPr>
@@ -926,7 +929,7 @@
     </w:tbl>
     <w:p>
       <w:pPr>
-        <w:pStyle w:val="Heading2"/>
+        <w:pStyle w:val="Titre2"/>
         <w:ind w:firstLine="360"/>
         <w:rPr>
           <w:sz w:val="24"/>
@@ -952,7 +955,7 @@
     </w:p>
     <w:p>
       <w:pPr>
-        <w:pStyle w:val="Heading2"/>
+        <w:pStyle w:val="Titre2"/>
         <w:ind w:firstLine="360"/>
         <w:rPr>
           <w:sz w:val="24"/>
@@ -1006,20 +1009,20 @@
     </w:p>
     <w:p>
       <w:pPr>
-        <w:pStyle w:val="Heading3"/>
-        <w:rPr>
-          <w:rStyle w:val="IntenseEmphasis"/>
-        </w:rPr>
-      </w:pPr>
-      <w:r>
-        <w:rPr>
-          <w:rStyle w:val="IntenseEmphasis"/>
+        <w:pStyle w:val="Titre3"/>
+        <w:rPr>
+          <w:rStyle w:val="Accentuationintense"/>
+        </w:rPr>
+      </w:pPr>
+      <w:r>
+        <w:rPr>
+          <w:rStyle w:val="Accentuationintense"/>
         </w:rPr>
         <w:t>Création de nouvelles classes</w:t>
       </w:r>
       <w:r>
         <w:rPr>
-          <w:rStyle w:val="IntenseEmphasis"/>
+          <w:rStyle w:val="Accentuationintense"/>
         </w:rPr>
         <w:t> :</w:t>
       </w:r>
@@ -1034,7 +1037,7 @@
     </w:p>
     <w:p>
       <w:pPr>
-        <w:pStyle w:val="ListParagraph"/>
+        <w:pStyle w:val="Paragraphedeliste"/>
         <w:numPr>
           <w:ilvl w:val="0"/>
           <w:numId w:val="17"/>
@@ -1096,7 +1099,7 @@
     </w:p>
     <w:p>
       <w:pPr>
-        <w:pStyle w:val="ListParagraph"/>
+        <w:pStyle w:val="Paragraphedeliste"/>
         <w:ind w:left="720"/>
         <w:rPr>
           <w:sz w:val="24"/>
@@ -1106,7 +1109,7 @@
     </w:p>
     <w:p>
       <w:pPr>
-        <w:pStyle w:val="ListParagraph"/>
+        <w:pStyle w:val="Paragraphedeliste"/>
         <w:numPr>
           <w:ilvl w:val="0"/>
           <w:numId w:val="17"/>
@@ -1221,7 +1224,7 @@
     </w:p>
     <w:p>
       <w:pPr>
-        <w:pStyle w:val="ListParagraph"/>
+        <w:pStyle w:val="Paragraphedeliste"/>
         <w:numPr>
           <w:ilvl w:val="0"/>
           <w:numId w:val="17"/>
@@ -1283,7 +1286,7 @@
     </w:p>
     <w:p>
       <w:pPr>
-        <w:pStyle w:val="ListParagraph"/>
+        <w:pStyle w:val="Paragraphedeliste"/>
         <w:rPr>
           <w:sz w:val="24"/>
           <w:szCs w:val="24"/>
@@ -1292,7 +1295,7 @@
     </w:p>
     <w:p>
       <w:pPr>
-        <w:pStyle w:val="ListParagraph"/>
+        <w:pStyle w:val="Paragraphedeliste"/>
         <w:numPr>
           <w:ilvl w:val="1"/>
           <w:numId w:val="17"/>
@@ -1410,7 +1413,7 @@
     </w:p>
     <w:p>
       <w:pPr>
-        <w:pStyle w:val="ListParagraph"/>
+        <w:pStyle w:val="Paragraphedeliste"/>
         <w:numPr>
           <w:ilvl w:val="1"/>
           <w:numId w:val="17"/>
@@ -1502,7 +1505,7 @@
     </w:p>
     <w:tbl>
       <w:tblPr>
-        <w:tblStyle w:val="TableGrid"/>
+        <w:tblStyle w:val="Grilledutableau"/>
         <w:tblW w:w="0" w:type="auto"/>
         <w:tblLook w:val="04A0" w:firstRow="1" w:lastRow="0" w:firstColumn="1" w:lastColumn="0" w:noHBand="0" w:noVBand="1"/>
       </w:tblPr>
@@ -1632,7 +1635,7 @@
     </w:p>
     <w:tbl>
       <w:tblPr>
-        <w:tblStyle w:val="TableGrid"/>
+        <w:tblStyle w:val="Grilledutableau"/>
         <w:tblW w:w="0" w:type="auto"/>
         <w:tblLook w:val="04A0" w:firstRow="1" w:lastRow="0" w:firstColumn="1" w:lastColumn="0" w:noHBand="0" w:noVBand="1"/>
       </w:tblPr>
@@ -1763,14 +1766,14 @@
     </w:p>
     <w:p>
       <w:pPr>
-        <w:pStyle w:val="Heading3"/>
-        <w:rPr>
-          <w:rStyle w:val="IntenseEmphasis"/>
-        </w:rPr>
-      </w:pPr>
-      <w:r>
-        <w:rPr>
-          <w:rStyle w:val="IntenseEmphasis"/>
+        <w:pStyle w:val="Titre3"/>
+        <w:rPr>
+          <w:rStyle w:val="Accentuationintense"/>
+        </w:rPr>
+      </w:pPr>
+      <w:r>
+        <w:rPr>
+          <w:rStyle w:val="Accentuationintense"/>
         </w:rPr>
         <w:lastRenderedPageBreak/>
         <w:t>Modification du modèle existant</w:t>
@@ -1786,7 +1789,7 @@
     </w:p>
     <w:p>
       <w:pPr>
-        <w:pStyle w:val="ListParagraph"/>
+        <w:pStyle w:val="Paragraphedeliste"/>
         <w:numPr>
           <w:ilvl w:val="0"/>
           <w:numId w:val="3"/>
@@ -1857,7 +1860,7 @@
     </w:p>
     <w:p>
       <w:pPr>
-        <w:pStyle w:val="ListParagraph"/>
+        <w:pStyle w:val="Paragraphedeliste"/>
         <w:numPr>
           <w:ilvl w:val="1"/>
           <w:numId w:val="3"/>
@@ -1888,7 +1891,7 @@
     </w:p>
     <w:p>
       <w:pPr>
-        <w:pStyle w:val="ListParagraph"/>
+        <w:pStyle w:val="Paragraphedeliste"/>
         <w:numPr>
           <w:ilvl w:val="1"/>
           <w:numId w:val="3"/>
@@ -1954,7 +1957,7 @@
     </w:p>
     <w:p>
       <w:pPr>
-        <w:pStyle w:val="ListParagraph"/>
+        <w:pStyle w:val="Paragraphedeliste"/>
         <w:numPr>
           <w:ilvl w:val="1"/>
           <w:numId w:val="3"/>
@@ -1993,7 +1996,7 @@
     </w:p>
     <w:p>
       <w:pPr>
-        <w:pStyle w:val="ListParagraph"/>
+        <w:pStyle w:val="Paragraphedeliste"/>
         <w:numPr>
           <w:ilvl w:val="0"/>
           <w:numId w:val="3"/>
@@ -2080,7 +2083,7 @@
     </w:p>
     <w:p>
       <w:pPr>
-        <w:pStyle w:val="ListParagraph"/>
+        <w:pStyle w:val="Paragraphedeliste"/>
         <w:ind w:left="360"/>
         <w:rPr>
           <w:sz w:val="24"/>
@@ -2090,7 +2093,7 @@
     </w:p>
     <w:p>
       <w:pPr>
-        <w:pStyle w:val="ListParagraph"/>
+        <w:pStyle w:val="Paragraphedeliste"/>
         <w:ind w:left="360"/>
         <w:rPr>
           <w:sz w:val="24"/>
@@ -2100,7 +2103,7 @@
     </w:p>
     <w:tbl>
       <w:tblPr>
-        <w:tblStyle w:val="TableGrid"/>
+        <w:tblStyle w:val="Grilledutableau"/>
         <w:tblW w:w="0" w:type="auto"/>
         <w:tblLook w:val="04A0" w:firstRow="1" w:lastRow="0" w:firstColumn="1" w:lastColumn="0" w:noHBand="0" w:noVBand="1"/>
       </w:tblPr>
@@ -2259,7 +2262,7 @@
     </w:p>
     <w:tbl>
       <w:tblPr>
-        <w:tblStyle w:val="TableGrid"/>
+        <w:tblStyle w:val="Grilledutableau"/>
         <w:tblW w:w="0" w:type="auto"/>
         <w:tblLook w:val="04A0" w:firstRow="1" w:lastRow="0" w:firstColumn="1" w:lastColumn="0" w:noHBand="0" w:noVBand="1"/>
       </w:tblPr>
@@ -2362,7 +2365,7 @@
     </w:p>
     <w:p>
       <w:pPr>
-        <w:pStyle w:val="ListParagraph"/>
+        <w:pStyle w:val="Paragraphedeliste"/>
         <w:numPr>
           <w:ilvl w:val="0"/>
           <w:numId w:val="19"/>
@@ -2380,7 +2383,7 @@
     </w:p>
     <w:p>
       <w:pPr>
-        <w:pStyle w:val="ListParagraph"/>
+        <w:pStyle w:val="Paragraphedeliste"/>
         <w:numPr>
           <w:ilvl w:val="0"/>
           <w:numId w:val="19"/>
@@ -2397,7 +2400,7 @@
     </w:p>
     <w:p>
       <w:pPr>
-        <w:pStyle w:val="ListParagraph"/>
+        <w:pStyle w:val="Paragraphedeliste"/>
         <w:numPr>
           <w:ilvl w:val="0"/>
           <w:numId w:val="19"/>
@@ -2415,7 +2418,7 @@
     </w:p>
     <w:p>
       <w:pPr>
-        <w:pStyle w:val="ListParagraph"/>
+        <w:pStyle w:val="Paragraphedeliste"/>
         <w:numPr>
           <w:ilvl w:val="0"/>
           <w:numId w:val="19"/>
@@ -2430,7 +2433,7 @@
     </w:p>
     <w:p>
       <w:pPr>
-        <w:pStyle w:val="ListParagraph"/>
+        <w:pStyle w:val="Paragraphedeliste"/>
         <w:numPr>
           <w:ilvl w:val="0"/>
           <w:numId w:val="19"/>
@@ -2448,7 +2451,7 @@
     </w:p>
     <w:p>
       <w:pPr>
-        <w:pStyle w:val="ListParagraph"/>
+        <w:pStyle w:val="Paragraphedeliste"/>
         <w:numPr>
           <w:ilvl w:val="0"/>
           <w:numId w:val="19"/>
@@ -2494,7 +2497,7 @@
 <w:ftr xmlns:wpc="http://schemas.microsoft.com/office/word/2010/wordprocessingCanvas" xmlns:cx="http://schemas.microsoft.com/office/drawing/2014/chartex" xmlns:cx1="http://schemas.microsoft.com/office/drawing/2015/9/8/chartex" xmlns:cx2="http://schemas.microsoft.com/office/drawing/2015/10/21/chartex" xmlns:cx3="http://schemas.microsoft.com/office/drawing/2016/5/9/chartex" xmlns:cx4="http://schemas.microsoft.com/office/drawing/2016/5/10/chartex" xmlns:cx5="http://schemas.microsoft.com/office/drawing/2016/5/11/chartex" xmlns:cx6="http://schemas.microsoft.com/office/drawing/2016/5/12/chartex" xmlns:cx7="http://schemas.microsoft.com/office/drawing/2016/5/13/chartex" xmlns:cx8="http://schemas.microsoft.com/office/drawing/2016/5/14/chartex" xmlns:mc="http://schemas.openxmlformats.org/markup-compatibility/2006" xmlns:aink="http://schemas.microsoft.com/office/drawing/2016/ink" xmlns:am3d="http://schemas.microsoft.com/office/drawing/2017/model3d" xmlns:o="urn:schemas-microsoft-com:office:office" xmlns:oel="http://schemas.microsoft.com/office/2019/extlst" xmlns:r="http://schemas.openxmlformats.org/officeDocument/2006/relationships" xmlns:m="http://schemas.openxmlformats.org/officeDocument/2006/math" xmlns:v="urn:schemas-microsoft-com:vml" xmlns:wp14="http://schemas.microsoft.com/office/word/2010/wordprocessingDrawing" xmlns:wp="http://schemas.openxmlformats.org/drawingml/2006/wordprocessingDrawing" xmlns:w10="urn:schemas-microsoft-com:office:word" xmlns:w="http://schemas.openxmlformats.org/wordprocessingml/2006/main" xmlns:w14="http://schemas.microsoft.com/office/word/2010/wordml" xmlns:w15="http://schemas.microsoft.com/office/word/2012/wordml" xmlns:w16cex="http://schemas.microsoft.com/office/word/2018/wordml/cex" xmlns:w16cid="http://schemas.microsoft.com/office/word/2016/wordml/cid" xmlns:w16="http://schemas.microsoft.com/office/word/2018/wordml" xmlns:w16du="http://schemas.microsoft.com/office/word/2023/wordml/word16du" xmlns:w16sdtdh="http://schemas.microsoft.com/office/word/2020/wordml/sdtdatahash" xmlns:w16sdtfl="http://schemas.microsoft.com/office/word/2024/wordml/sdtformatlock" xmlns:w16se="http://schemas.microsoft.com/office/word/2015/wordml/symex" xmlns:wpg="http://schemas.microsoft.com/office/word/2010/wordprocessingGroup" xmlns:wpi="http://schemas.microsoft.com/office/word/2010/wordprocessingInk" xmlns:wne="http://schemas.microsoft.com/office/word/2006/wordml" xmlns:wps="http://schemas.microsoft.com/office/word/2010/wordprocessingShape" mc:Ignorable="w14 w15 w16se w16cid w16 w16cex w16sdtdh w16sdtfl w16du wp14">
   <w:p>
     <w:pPr>
-      <w:pStyle w:val="Footer"/>
+      <w:pStyle w:val="Pieddepage"/>
       <w:pBdr>
         <w:top w:val="single" w:sz="4" w:space="1" w:color="auto"/>
       </w:pBdr>
@@ -2506,7 +2509,7 @@
       </w:tabs>
       <w:ind w:right="4"/>
       <w:rPr>
-        <w:rStyle w:val="PageNumber"/>
+        <w:rStyle w:val="Numrodepage"/>
       </w:rPr>
     </w:pPr>
     <w:r>
@@ -2514,76 +2517,76 @@
     </w:r>
     <w:r>
       <w:rPr>
-        <w:rStyle w:val="PageNumber"/>
+        <w:rStyle w:val="Numrodepage"/>
       </w:rPr>
       <w:fldChar w:fldCharType="begin"/>
     </w:r>
     <w:r>
       <w:rPr>
-        <w:rStyle w:val="PageNumber"/>
+        <w:rStyle w:val="Numrodepage"/>
       </w:rPr>
       <w:instrText xml:space="preserve"> PAGE </w:instrText>
     </w:r>
     <w:r>
       <w:rPr>
-        <w:rStyle w:val="PageNumber"/>
+        <w:rStyle w:val="Numrodepage"/>
       </w:rPr>
       <w:fldChar w:fldCharType="separate"/>
     </w:r>
     <w:r>
       <w:rPr>
-        <w:rStyle w:val="PageNumber"/>
+        <w:rStyle w:val="Numrodepage"/>
         <w:noProof/>
       </w:rPr>
       <w:t>3</w:t>
     </w:r>
     <w:r>
       <w:rPr>
-        <w:rStyle w:val="PageNumber"/>
+        <w:rStyle w:val="Numrodepage"/>
       </w:rPr>
       <w:fldChar w:fldCharType="end"/>
     </w:r>
     <w:r>
       <w:rPr>
-        <w:rStyle w:val="PageNumber"/>
+        <w:rStyle w:val="Numrodepage"/>
       </w:rPr>
       <w:t>/</w:t>
     </w:r>
     <w:r>
       <w:rPr>
-        <w:rStyle w:val="PageNumber"/>
+        <w:rStyle w:val="Numrodepage"/>
       </w:rPr>
       <w:fldChar w:fldCharType="begin"/>
     </w:r>
     <w:r>
       <w:rPr>
-        <w:rStyle w:val="PageNumber"/>
+        <w:rStyle w:val="Numrodepage"/>
       </w:rPr>
       <w:instrText xml:space="preserve"> NUMPAGES </w:instrText>
     </w:r>
     <w:r>
       <w:rPr>
-        <w:rStyle w:val="PageNumber"/>
+        <w:rStyle w:val="Numrodepage"/>
       </w:rPr>
       <w:fldChar w:fldCharType="separate"/>
     </w:r>
     <w:r>
       <w:rPr>
-        <w:rStyle w:val="PageNumber"/>
+        <w:rStyle w:val="Numrodepage"/>
         <w:noProof/>
       </w:rPr>
       <w:t>3</w:t>
     </w:r>
     <w:r>
       <w:rPr>
-        <w:rStyle w:val="PageNumber"/>
+        <w:rStyle w:val="Numrodepage"/>
       </w:rPr>
       <w:fldChar w:fldCharType="end"/>
     </w:r>
   </w:p>
   <w:p>
     <w:pPr>
-      <w:pStyle w:val="Footer"/>
+      <w:pStyle w:val="Pieddepage"/>
       <w:tabs>
         <w:tab w:val="clear" w:pos="4320"/>
         <w:tab w:val="center" w:pos="4820"/>
@@ -2591,7 +2594,7 @@
     </w:pPr>
     <w:r>
       <w:rPr>
-        <w:rStyle w:val="PageNumber"/>
+        <w:rStyle w:val="Numrodepage"/>
       </w:rPr>
       <w:tab/>
     </w:r>
@@ -5844,7 +5847,7 @@
       <w:rFonts w:ascii="Arial" w:hAnsi="Arial"/>
     </w:rPr>
   </w:style>
-  <w:style w:type="paragraph" w:styleId="Heading1">
+  <w:style w:type="paragraph" w:styleId="Titre1">
     <w:name w:val="heading 1"/>
     <w:basedOn w:val="Normal"/>
     <w:next w:val="Normal"/>
@@ -5865,11 +5868,11 @@
       <w:sz w:val="22"/>
     </w:rPr>
   </w:style>
-  <w:style w:type="paragraph" w:styleId="Heading2">
+  <w:style w:type="paragraph" w:styleId="Titre2">
     <w:name w:val="heading 2"/>
     <w:basedOn w:val="Normal"/>
     <w:next w:val="Normal"/>
-    <w:link w:val="Heading2Char"/>
+    <w:link w:val="Titre2Car"/>
     <w:qFormat/>
     <w:rsid w:val="00670098"/>
     <w:pPr>
@@ -5881,7 +5884,7 @@
       <w:b/>
     </w:rPr>
   </w:style>
-  <w:style w:type="paragraph" w:styleId="Heading3">
+  <w:style w:type="paragraph" w:styleId="Titre3">
     <w:name w:val="heading 3"/>
     <w:basedOn w:val="Normal"/>
     <w:next w:val="Normal"/>
@@ -5897,7 +5900,7 @@
       <w:sz w:val="24"/>
     </w:rPr>
   </w:style>
-  <w:style w:type="paragraph" w:styleId="Heading4">
+  <w:style w:type="paragraph" w:styleId="Titre4">
     <w:name w:val="heading 4"/>
     <w:basedOn w:val="Normal"/>
     <w:next w:val="Normal"/>
@@ -5912,7 +5915,7 @@
       <w:sz w:val="22"/>
     </w:rPr>
   </w:style>
-  <w:style w:type="paragraph" w:styleId="Heading5">
+  <w:style w:type="paragraph" w:styleId="Titre5">
     <w:name w:val="heading 5"/>
     <w:basedOn w:val="Normal"/>
     <w:next w:val="Normal"/>
@@ -5927,7 +5930,7 @@
       <w:sz w:val="24"/>
     </w:rPr>
   </w:style>
-  <w:style w:type="paragraph" w:styleId="Heading6">
+  <w:style w:type="paragraph" w:styleId="Titre6">
     <w:name w:val="heading 6"/>
     <w:basedOn w:val="Normal"/>
     <w:next w:val="Normal"/>
@@ -5948,7 +5951,7 @@
       <w:sz w:val="28"/>
     </w:rPr>
   </w:style>
-  <w:style w:type="paragraph" w:styleId="Heading7">
+  <w:style w:type="paragraph" w:styleId="Titre7">
     <w:name w:val="heading 7"/>
     <w:basedOn w:val="Normal"/>
     <w:next w:val="Normal"/>
@@ -5963,7 +5966,7 @@
       <w:sz w:val="22"/>
     </w:rPr>
   </w:style>
-  <w:style w:type="paragraph" w:styleId="Heading8">
+  <w:style w:type="paragraph" w:styleId="Titre8">
     <w:name w:val="heading 8"/>
     <w:basedOn w:val="Normal"/>
     <w:next w:val="Normal"/>
@@ -5977,7 +5980,7 @@
       <w:sz w:val="22"/>
     </w:rPr>
   </w:style>
-  <w:style w:type="paragraph" w:styleId="Heading9">
+  <w:style w:type="paragraph" w:styleId="Titre9">
     <w:name w:val="heading 9"/>
     <w:basedOn w:val="Normal"/>
     <w:next w:val="Normal"/>
@@ -5993,13 +5996,13 @@
       <w:sz w:val="28"/>
     </w:rPr>
   </w:style>
-  <w:style w:type="character" w:default="1" w:styleId="DefaultParagraphFont">
+  <w:style w:type="character" w:default="1" w:styleId="Policepardfaut">
     <w:name w:val="Default Paragraph Font"/>
     <w:uiPriority w:val="1"/>
     <w:semiHidden/>
     <w:unhideWhenUsed/>
   </w:style>
-  <w:style w:type="table" w:default="1" w:styleId="TableNormal">
+  <w:style w:type="table" w:default="1" w:styleId="TableauNormal">
     <w:name w:val="Normal Table"/>
     <w:uiPriority w:val="99"/>
     <w:semiHidden/>
@@ -6014,13 +6017,13 @@
       </w:tblCellMar>
     </w:tblPr>
   </w:style>
-  <w:style w:type="numbering" w:default="1" w:styleId="NoList">
+  <w:style w:type="numbering" w:default="1" w:styleId="Aucuneliste">
     <w:name w:val="No List"/>
     <w:uiPriority w:val="99"/>
     <w:semiHidden/>
     <w:unhideWhenUsed/>
   </w:style>
-  <w:style w:type="paragraph" w:styleId="Header">
+  <w:style w:type="paragraph" w:styleId="En-tte">
     <w:name w:val="header"/>
     <w:basedOn w:val="Normal"/>
     <w:pPr>
@@ -6030,10 +6033,10 @@
       </w:tabs>
     </w:pPr>
   </w:style>
-  <w:style w:type="paragraph" w:styleId="Footer">
+  <w:style w:type="paragraph" w:styleId="Pieddepage">
     <w:name w:val="footer"/>
     <w:basedOn w:val="Normal"/>
-    <w:link w:val="FooterChar"/>
+    <w:link w:val="PieddepageCar"/>
     <w:pPr>
       <w:tabs>
         <w:tab w:val="center" w:pos="4320"/>
@@ -6041,9 +6044,9 @@
       </w:tabs>
     </w:pPr>
   </w:style>
-  <w:style w:type="character" w:styleId="PageNumber">
+  <w:style w:type="character" w:styleId="Numrodepage">
     <w:name w:val="page number"/>
-    <w:basedOn w:val="DefaultParagraphFont"/>
+    <w:basedOn w:val="Policepardfaut"/>
   </w:style>
   <w:style w:type="paragraph" w:customStyle="1" w:styleId="Lb1">
     <w:name w:val="Lb1"/>
@@ -6061,7 +6064,7 @@
       <w:lang w:val="fr-FR"/>
     </w:rPr>
   </w:style>
-  <w:style w:type="paragraph" w:styleId="BodyText">
+  <w:style w:type="paragraph" w:styleId="Corpsdetexte">
     <w:name w:val="Body Text"/>
     <w:basedOn w:val="Normal"/>
     <w:pPr>
@@ -6105,7 +6108,7 @@
   </w:style>
   <w:style w:type="paragraph" w:customStyle="1" w:styleId="titresection">
     <w:name w:val="titre section"/>
-    <w:basedOn w:val="Heading5"/>
+    <w:basedOn w:val="Titre5"/>
     <w:pPr>
       <w:pBdr>
         <w:top w:val="single" w:sz="4" w:space="1" w:color="auto"/>
@@ -6239,7 +6242,7 @@
       </w:tabs>
     </w:pPr>
   </w:style>
-  <w:style w:type="character" w:styleId="Hyperlink">
+  <w:style w:type="character" w:styleId="Lienhypertexte">
     <w:name w:val="Hyperlink"/>
     <w:rsid w:val="00177AA8"/>
     <w:rPr>
@@ -6303,7 +6306,7 @@
       <w:lang w:eastAsia="fr-CA"/>
     </w:rPr>
   </w:style>
-  <w:style w:type="character" w:styleId="FollowedHyperlink">
+  <w:style w:type="character" w:styleId="Lienhypertextesuivivisit">
     <w:name w:val="FollowedHyperlink"/>
     <w:rsid w:val="00A97EE7"/>
     <w:rPr>
@@ -6311,7 +6314,7 @@
       <w:u w:val="single"/>
     </w:rPr>
   </w:style>
-  <w:style w:type="paragraph" w:styleId="ListParagraph">
+  <w:style w:type="paragraph" w:styleId="Paragraphedeliste">
     <w:name w:val="List Paragraph"/>
     <w:basedOn w:val="Normal"/>
     <w:uiPriority w:val="34"/>
@@ -6323,12 +6326,12 @@
   </w:style>
   <w:style w:type="character" w:customStyle="1" w:styleId="apple-converted-space">
     <w:name w:val="apple-converted-space"/>
-    <w:basedOn w:val="DefaultParagraphFont"/>
+    <w:basedOn w:val="Policepardfaut"/>
     <w:rsid w:val="00F20EEA"/>
   </w:style>
   <w:style w:type="character" w:customStyle="1" w:styleId="notlocalizable">
     <w:name w:val="notlocalizable"/>
-    <w:basedOn w:val="DefaultParagraphFont"/>
+    <w:basedOn w:val="Policepardfaut"/>
     <w:rsid w:val="00F20EEA"/>
   </w:style>
   <w:style w:type="paragraph" w:customStyle="1" w:styleId="para">
@@ -6345,10 +6348,10 @@
       <w:lang w:eastAsia="fr-CA"/>
     </w:rPr>
   </w:style>
-  <w:style w:type="paragraph" w:styleId="BalloonText">
+  <w:style w:type="paragraph" w:styleId="Textedebulles">
     <w:name w:val="Balloon Text"/>
     <w:basedOn w:val="Normal"/>
-    <w:link w:val="BalloonTextChar"/>
+    <w:link w:val="TextedebullesCar"/>
     <w:rsid w:val="00976591"/>
     <w:rPr>
       <w:rFonts w:ascii="Lucida Grande" w:hAnsi="Lucida Grande" w:cs="Lucida Grande"/>
@@ -6356,10 +6359,10 @@
       <w:szCs w:val="18"/>
     </w:rPr>
   </w:style>
-  <w:style w:type="character" w:customStyle="1" w:styleId="BalloonTextChar">
-    <w:name w:val="Balloon Text Char"/>
-    <w:basedOn w:val="DefaultParagraphFont"/>
-    <w:link w:val="BalloonText"/>
+  <w:style w:type="character" w:customStyle="1" w:styleId="TextedebullesCar">
+    <w:name w:val="Texte de bulles Car"/>
+    <w:basedOn w:val="Policepardfaut"/>
+    <w:link w:val="Textedebulles"/>
     <w:rsid w:val="00976591"/>
     <w:rPr>
       <w:rFonts w:ascii="Lucida Grande" w:hAnsi="Lucida Grande" w:cs="Lucida Grande"/>
@@ -6383,9 +6386,9 @@
       <w:lang w:eastAsia="fr-CA"/>
     </w:rPr>
   </w:style>
-  <w:style w:type="character" w:customStyle="1" w:styleId="FooterChar">
-    <w:name w:val="Footer Char"/>
-    <w:link w:val="Footer"/>
+  <w:style w:type="character" w:customStyle="1" w:styleId="PieddepageCar">
+    <w:name w:val="Pied de page Car"/>
+    <w:link w:val="Pieddepage"/>
     <w:rsid w:val="001440F8"/>
     <w:rPr>
       <w:rFonts w:ascii="Arial" w:hAnsi="Arial"/>
@@ -6393,26 +6396,26 @@
   </w:style>
   <w:style w:type="character" w:customStyle="1" w:styleId="Mentionnonrsolue1">
     <w:name w:val="Mention non résolue1"/>
-    <w:basedOn w:val="DefaultParagraphFont"/>
+    <w:basedOn w:val="Policepardfaut"/>
     <w:rsid w:val="004A7E1D"/>
     <w:rPr>
       <w:color w:val="605E5C"/>
       <w:shd w:val="clear" w:color="auto" w:fill="E1DFDD"/>
     </w:rPr>
   </w:style>
-  <w:style w:type="character" w:customStyle="1" w:styleId="Heading2Char">
-    <w:name w:val="Heading 2 Char"/>
-    <w:basedOn w:val="DefaultParagraphFont"/>
-    <w:link w:val="Heading2"/>
+  <w:style w:type="character" w:customStyle="1" w:styleId="Titre2Car">
+    <w:name w:val="Titre 2 Car"/>
+    <w:basedOn w:val="Policepardfaut"/>
+    <w:link w:val="Titre2"/>
     <w:rsid w:val="00194479"/>
     <w:rPr>
       <w:rFonts w:ascii="Arial" w:hAnsi="Arial"/>
       <w:b/>
     </w:rPr>
   </w:style>
-  <w:style w:type="table" w:styleId="TableGrid">
+  <w:style w:type="table" w:styleId="Grilledutableau">
     <w:name w:val="Table Grid"/>
-    <w:basedOn w:val="TableNormal"/>
+    <w:basedOn w:val="TableauNormal"/>
     <w:rsid w:val="006C3CD4"/>
     <w:tblPr>
       <w:tblBorders>
@@ -6425,9 +6428,9 @@
       </w:tblBorders>
     </w:tblPr>
   </w:style>
-  <w:style w:type="character" w:styleId="IntenseEmphasis">
+  <w:style w:type="character" w:styleId="Accentuationintense">
     <w:name w:val="Intense Emphasis"/>
-    <w:basedOn w:val="DefaultParagraphFont"/>
+    <w:basedOn w:val="Policepardfaut"/>
     <w:uiPriority w:val="21"/>
     <w:qFormat/>
     <w:rsid w:val="00C407AC"/>
@@ -6761,21 +6764,6 @@
 </file>
 
 <file path=customXml/item1.xml><?xml version="1.0" encoding="utf-8"?>
-<?mso-contentType ?>
-<FormTemplates xmlns="http://schemas.microsoft.com/sharepoint/v3/contenttype/forms">
-  <Display>DocumentLibraryForm</Display>
-  <Edit>DocumentLibraryForm</Edit>
-  <New>DocumentLibraryForm</New>
-</FormTemplates>
-</file>
-
-<file path=customXml/item2.xml><?xml version="1.0" encoding="utf-8"?>
-<p:properties xmlns:p="http://schemas.microsoft.com/office/2006/metadata/properties" xmlns:xsi="http://www.w3.org/2001/XMLSchema-instance" xmlns:pc="http://schemas.microsoft.com/office/infopath/2007/PartnerControls">
-  <documentManagement/>
-</p:properties>
-</file>
-
-<file path=customXml/item3.xml><?xml version="1.0" encoding="utf-8"?>
 <ct:contentTypeSchema xmlns:ct="http://schemas.microsoft.com/office/2006/metadata/contentType" xmlns:ma="http://schemas.microsoft.com/office/2006/metadata/properties/metaAttributes" ct:_="" ma:_="" ma:contentTypeName="Document" ma:contentTypeID="0x0101009C1B447D0B687849A1AF4D1976CDC009" ma:contentTypeVersion="12" ma:contentTypeDescription="Crée un document." ma:contentTypeScope="" ma:versionID="fe03336f97a1e4400bd691f3c50c45f2">
   <xsd:schema xmlns:xsd="http://www.w3.org/2001/XMLSchema" xmlns:xs="http://www.w3.org/2001/XMLSchema" xmlns:p="http://schemas.microsoft.com/office/2006/metadata/properties" xmlns:ns2="8b4e9889-ac42-40cc-888d-9712bfd820ad" xmlns:ns3="c69bbd0b-e922-4934-baed-3b7d43bfb0c6" targetNamespace="http://schemas.microsoft.com/office/2006/metadata/properties" ma:root="true" ma:fieldsID="f574614f4cec920772ca5d9ed687af9f" ns2:_="" ns3:_="">
     <xsd:import namespace="8b4e9889-ac42-40cc-888d-9712bfd820ad"/>
@@ -6992,28 +6980,26 @@
 </ct:contentTypeSchema>
 </file>
 
+<file path=customXml/item2.xml><?xml version="1.0" encoding="utf-8"?>
+<p:properties xmlns:p="http://schemas.microsoft.com/office/2006/metadata/properties" xmlns:xsi="http://www.w3.org/2001/XMLSchema-instance" xmlns:pc="http://schemas.microsoft.com/office/infopath/2007/PartnerControls">
+  <documentManagement/>
+</p:properties>
+</file>
+
+<file path=customXml/item3.xml><?xml version="1.0" encoding="utf-8"?>
+<?mso-contentType ?>
+<FormTemplates xmlns="http://schemas.microsoft.com/sharepoint/v3/contenttype/forms">
+  <Display>DocumentLibraryForm</Display>
+  <Edit>DocumentLibraryForm</Edit>
+  <New>DocumentLibraryForm</New>
+</FormTemplates>
+</file>
+
 <file path=customXml/item4.xml><?xml version="1.0" encoding="utf-8"?>
 <b:Sources xmlns:b="http://schemas.openxmlformats.org/officeDocument/2006/bibliography" xmlns="http://schemas.openxmlformats.org/officeDocument/2006/bibliography" SelectedStyle="\APA.XSL" StyleName="APA"/>
 </file>
 
 <file path=customXml/itemProps1.xml><?xml version="1.0" encoding="utf-8"?>
-<ds:datastoreItem xmlns:ds="http://schemas.openxmlformats.org/officeDocument/2006/customXml" ds:itemID="{DC5743D9-90E8-4705-BD73-39E0AE4FDF6F}">
-  <ds:schemaRefs>
-    <ds:schemaRef ds:uri="http://schemas.microsoft.com/sharepoint/v3/contenttype/forms"/>
-  </ds:schemaRefs>
-</ds:datastoreItem>
-</file>
-
-<file path=customXml/itemProps2.xml><?xml version="1.0" encoding="utf-8"?>
-<ds:datastoreItem xmlns:ds="http://schemas.openxmlformats.org/officeDocument/2006/customXml" ds:itemID="{9DF1F198-947F-4E15-85D4-C4A2BF14403A}">
-  <ds:schemaRefs>
-    <ds:schemaRef ds:uri="http://schemas.microsoft.com/office/2006/metadata/properties"/>
-    <ds:schemaRef ds:uri="http://schemas.microsoft.com/office/infopath/2007/PartnerControls"/>
-  </ds:schemaRefs>
-</ds:datastoreItem>
-</file>
-
-<file path=customXml/itemProps3.xml><?xml version="1.0" encoding="utf-8"?>
 <ds:datastoreItem xmlns:ds="http://schemas.openxmlformats.org/officeDocument/2006/customXml" ds:itemID="{1BBC0A6D-47F3-44FE-AED0-DC85C3D3569D}">
   <ds:schemaRefs>
     <ds:schemaRef ds:uri="http://schemas.microsoft.com/office/2006/metadata/contentType"/>
@@ -7032,6 +7018,23 @@
 </ds:datastoreItem>
 </file>
 
+<file path=customXml/itemProps2.xml><?xml version="1.0" encoding="utf-8"?>
+<ds:datastoreItem xmlns:ds="http://schemas.openxmlformats.org/officeDocument/2006/customXml" ds:itemID="{9DF1F198-947F-4E15-85D4-C4A2BF14403A}">
+  <ds:schemaRefs>
+    <ds:schemaRef ds:uri="http://schemas.microsoft.com/office/2006/metadata/properties"/>
+    <ds:schemaRef ds:uri="http://schemas.microsoft.com/office/infopath/2007/PartnerControls"/>
+  </ds:schemaRefs>
+</ds:datastoreItem>
+</file>
+
+<file path=customXml/itemProps3.xml><?xml version="1.0" encoding="utf-8"?>
+<ds:datastoreItem xmlns:ds="http://schemas.openxmlformats.org/officeDocument/2006/customXml" ds:itemID="{DC5743D9-90E8-4705-BD73-39E0AE4FDF6F}">
+  <ds:schemaRefs>
+    <ds:schemaRef ds:uri="http://schemas.microsoft.com/sharepoint/v3/contenttype/forms"/>
+  </ds:schemaRefs>
+</ds:datastoreItem>
+</file>
+
 <file path=customXml/itemProps4.xml><?xml version="1.0" encoding="utf-8"?>
 <ds:datastoreItem xmlns:ds="http://schemas.openxmlformats.org/officeDocument/2006/customXml" ds:itemID="{2EF541C5-2E96-4453-A2B9-57DE2C8172DB}">
   <ds:schemaRefs>

</xml_diff>

<commit_message>
Ajout de la capture de l'historique
</commit_message>
<xml_diff>
--- a/TP2-GSG_KR/TP 2 GIT H26.docx
+++ b/TP2-GSG_KR/TP 2 GIT H26.docx
@@ -718,13 +718,8 @@
         <w:t xml:space="preserve">aux moments opportuns </w:t>
       </w:r>
       <w:r>
-        <w:t xml:space="preserve">et toujours avoir des messages clairs et complets. On ne vous donne pas de consigne pour faire les </w:t>
-      </w:r>
-      <w:proofErr w:type="spellStart"/>
-      <w:r>
-        <w:t>commits</w:t>
-      </w:r>
-      <w:proofErr w:type="spellEnd"/>
+        <w:t>et toujours avoir des messages clairs et complets. On ne vous donne pas de consigne pour faire les commits</w:t>
+      </w:r>
       <w:r>
         <w:t>, push et pull</w:t>
       </w:r>
@@ -1180,23 +1175,7 @@
           <w:sz w:val="24"/>
           <w:szCs w:val="24"/>
         </w:rPr>
-        <w:t xml:space="preserve"> Le pays doit maintenant remplacer l’attribut </w:t>
-      </w:r>
-      <w:proofErr w:type="spellStart"/>
-      <w:r>
-        <w:rPr>
-          <w:sz w:val="24"/>
-          <w:szCs w:val="24"/>
-        </w:rPr>
-        <w:t>paysOrigine</w:t>
-      </w:r>
-      <w:proofErr w:type="spellEnd"/>
-      <w:r>
-        <w:rPr>
-          <w:sz w:val="24"/>
-          <w:szCs w:val="24"/>
-        </w:rPr>
-        <w:t xml:space="preserve"> de l’Auteur qui passe de String à Pays, et corrigez ce qui doit l’</w:t>
+        <w:t xml:space="preserve"> Le pays doit maintenant remplacer l’attribut paysOrigine de l’Auteur qui passe de String à Pays, et corrigez ce qui doit l’</w:t>
       </w:r>
       <w:r>
         <w:rPr>
@@ -1688,11 +1667,53 @@
           </w:p>
           <w:p>
             <w:pPr>
+              <w:jc w:val="center"/>
               <w:rPr>
                 <w:sz w:val="24"/>
                 <w:szCs w:val="24"/>
               </w:rPr>
             </w:pPr>
+            <w:r>
+              <w:rPr>
+                <w:sz w:val="24"/>
+                <w:szCs w:val="24"/>
+              </w:rPr>
+              <w:drawing>
+                <wp:inline distT="0" distB="0" distL="0" distR="0" wp14:anchorId="4D33632D" wp14:editId="7EA37AB6">
+                  <wp:extent cx="6153150" cy="2345996"/>
+                  <wp:effectExtent l="0" t="0" r="0" b="0"/>
+                  <wp:docPr id="2074247644" name="Image 1"/>
+                  <wp:cNvGraphicFramePr>
+                    <a:graphicFrameLocks xmlns:a="http://schemas.openxmlformats.org/drawingml/2006/main" noChangeAspect="1"/>
+                  </wp:cNvGraphicFramePr>
+                  <a:graphic xmlns:a="http://schemas.openxmlformats.org/drawingml/2006/main">
+                    <a:graphicData uri="http://schemas.openxmlformats.org/drawingml/2006/picture">
+                      <pic:pic xmlns:pic="http://schemas.openxmlformats.org/drawingml/2006/picture">
+                        <pic:nvPicPr>
+                          <pic:cNvPr id="2074247644" name=""/>
+                          <pic:cNvPicPr/>
+                        </pic:nvPicPr>
+                        <pic:blipFill>
+                          <a:blip r:embed="rId11"/>
+                          <a:stretch>
+                            <a:fillRect/>
+                          </a:stretch>
+                        </pic:blipFill>
+                        <pic:spPr>
+                          <a:xfrm>
+                            <a:off x="0" y="0"/>
+                            <a:ext cx="6169637" cy="2352282"/>
+                          </a:xfrm>
+                          <a:prstGeom prst="rect">
+                            <a:avLst/>
+                          </a:prstGeom>
+                        </pic:spPr>
+                      </pic:pic>
+                    </a:graphicData>
+                  </a:graphic>
+                </wp:inline>
+              </w:drawing>
+            </w:r>
           </w:p>
           <w:p>
             <w:pPr>
@@ -1725,6 +1746,7 @@
           <w:sz w:val="24"/>
           <w:szCs w:val="24"/>
         </w:rPr>
+        <w:lastRenderedPageBreak/>
         <w:t xml:space="preserve">A ce stade vérifiez que chacun de vous </w:t>
       </w:r>
       <w:r>
@@ -1870,7 +1892,6 @@
           <w:szCs w:val="24"/>
         </w:rPr>
       </w:pPr>
-      <w:proofErr w:type="spellStart"/>
       <w:r>
         <w:rPr>
           <w:b/>
@@ -1880,7 +1901,6 @@
         </w:rPr>
         <w:t>OuvragePapier</w:t>
       </w:r>
-      <w:proofErr w:type="spellEnd"/>
       <w:r>
         <w:rPr>
           <w:sz w:val="24"/>
@@ -1901,7 +1921,6 @@
           <w:szCs w:val="24"/>
         </w:rPr>
       </w:pPr>
-      <w:proofErr w:type="spellStart"/>
       <w:r>
         <w:rPr>
           <w:b/>
@@ -1911,7 +1930,6 @@
         </w:rPr>
         <w:t>OuvrageAudio</w:t>
       </w:r>
-      <w:proofErr w:type="spellEnd"/>
       <w:r>
         <w:rPr>
           <w:sz w:val="24"/>
@@ -1967,7 +1985,6 @@
           <w:szCs w:val="24"/>
         </w:rPr>
       </w:pPr>
-      <w:proofErr w:type="spellStart"/>
       <w:r>
         <w:rPr>
           <w:b/>
@@ -1977,7 +1994,6 @@
         </w:rPr>
         <w:t>OuvageVideo</w:t>
       </w:r>
-      <w:proofErr w:type="spellEnd"/>
       <w:r>
         <w:rPr>
           <w:sz w:val="24"/>
@@ -2389,13 +2405,8 @@
           <w:numId w:val="19"/>
         </w:numPr>
       </w:pPr>
-      <w:proofErr w:type="spellStart"/>
-      <w:r>
-        <w:t>Commits</w:t>
-      </w:r>
-      <w:proofErr w:type="spellEnd"/>
-      <w:r>
-        <w:t xml:space="preserve"> fréquents et pertinents</w:t>
+      <w:r>
+        <w:t>Commits fréquents et pertinents</w:t>
       </w:r>
     </w:p>
     <w:p>
@@ -2465,7 +2476,7 @@
       </w:r>
     </w:p>
     <w:sectPr>
-      <w:footerReference w:type="default" r:id="rId11"/>
+      <w:footerReference w:type="default" r:id="rId12"/>
       <w:pgSz w:w="12240" w:h="15840" w:code="1"/>
       <w:pgMar w:top="851" w:right="1134" w:bottom="851" w:left="1134" w:header="680" w:footer="680" w:gutter="0"/>
       <w:cols w:space="720"/>
@@ -6764,6 +6775,21 @@
 </file>
 
 <file path=customXml/item1.xml><?xml version="1.0" encoding="utf-8"?>
+<?mso-contentType ?>
+<FormTemplates xmlns="http://schemas.microsoft.com/sharepoint/v3/contenttype/forms">
+  <Display>DocumentLibraryForm</Display>
+  <Edit>DocumentLibraryForm</Edit>
+  <New>DocumentLibraryForm</New>
+</FormTemplates>
+</file>
+
+<file path=customXml/item2.xml><?xml version="1.0" encoding="utf-8"?>
+<p:properties xmlns:p="http://schemas.microsoft.com/office/2006/metadata/properties" xmlns:xsi="http://www.w3.org/2001/XMLSchema-instance" xmlns:pc="http://schemas.microsoft.com/office/infopath/2007/PartnerControls">
+  <documentManagement/>
+</p:properties>
+</file>
+
+<file path=customXml/item3.xml><?xml version="1.0" encoding="utf-8"?>
 <ct:contentTypeSchema xmlns:ct="http://schemas.microsoft.com/office/2006/metadata/contentType" xmlns:ma="http://schemas.microsoft.com/office/2006/metadata/properties/metaAttributes" ct:_="" ma:_="" ma:contentTypeName="Document" ma:contentTypeID="0x0101009C1B447D0B687849A1AF4D1976CDC009" ma:contentTypeVersion="12" ma:contentTypeDescription="Crée un document." ma:contentTypeScope="" ma:versionID="fe03336f97a1e4400bd691f3c50c45f2">
   <xsd:schema xmlns:xsd="http://www.w3.org/2001/XMLSchema" xmlns:xs="http://www.w3.org/2001/XMLSchema" xmlns:p="http://schemas.microsoft.com/office/2006/metadata/properties" xmlns:ns2="8b4e9889-ac42-40cc-888d-9712bfd820ad" xmlns:ns3="c69bbd0b-e922-4934-baed-3b7d43bfb0c6" targetNamespace="http://schemas.microsoft.com/office/2006/metadata/properties" ma:root="true" ma:fieldsID="f574614f4cec920772ca5d9ed687af9f" ns2:_="" ns3:_="">
     <xsd:import namespace="8b4e9889-ac42-40cc-888d-9712bfd820ad"/>
@@ -6980,26 +7006,28 @@
 </ct:contentTypeSchema>
 </file>
 
-<file path=customXml/item2.xml><?xml version="1.0" encoding="utf-8"?>
-<p:properties xmlns:p="http://schemas.microsoft.com/office/2006/metadata/properties" xmlns:xsi="http://www.w3.org/2001/XMLSchema-instance" xmlns:pc="http://schemas.microsoft.com/office/infopath/2007/PartnerControls">
-  <documentManagement/>
-</p:properties>
-</file>
-
-<file path=customXml/item3.xml><?xml version="1.0" encoding="utf-8"?>
-<?mso-contentType ?>
-<FormTemplates xmlns="http://schemas.microsoft.com/sharepoint/v3/contenttype/forms">
-  <Display>DocumentLibraryForm</Display>
-  <Edit>DocumentLibraryForm</Edit>
-  <New>DocumentLibraryForm</New>
-</FormTemplates>
-</file>
-
 <file path=customXml/item4.xml><?xml version="1.0" encoding="utf-8"?>
 <b:Sources xmlns:b="http://schemas.openxmlformats.org/officeDocument/2006/bibliography" xmlns="http://schemas.openxmlformats.org/officeDocument/2006/bibliography" SelectedStyle="\APA.XSL" StyleName="APA"/>
 </file>
 
 <file path=customXml/itemProps1.xml><?xml version="1.0" encoding="utf-8"?>
+<ds:datastoreItem xmlns:ds="http://schemas.openxmlformats.org/officeDocument/2006/customXml" ds:itemID="{DC5743D9-90E8-4705-BD73-39E0AE4FDF6F}">
+  <ds:schemaRefs>
+    <ds:schemaRef ds:uri="http://schemas.microsoft.com/sharepoint/v3/contenttype/forms"/>
+  </ds:schemaRefs>
+</ds:datastoreItem>
+</file>
+
+<file path=customXml/itemProps2.xml><?xml version="1.0" encoding="utf-8"?>
+<ds:datastoreItem xmlns:ds="http://schemas.openxmlformats.org/officeDocument/2006/customXml" ds:itemID="{9DF1F198-947F-4E15-85D4-C4A2BF14403A}">
+  <ds:schemaRefs>
+    <ds:schemaRef ds:uri="http://schemas.microsoft.com/office/2006/metadata/properties"/>
+    <ds:schemaRef ds:uri="http://schemas.microsoft.com/office/infopath/2007/PartnerControls"/>
+  </ds:schemaRefs>
+</ds:datastoreItem>
+</file>
+
+<file path=customXml/itemProps3.xml><?xml version="1.0" encoding="utf-8"?>
 <ds:datastoreItem xmlns:ds="http://schemas.openxmlformats.org/officeDocument/2006/customXml" ds:itemID="{1BBC0A6D-47F3-44FE-AED0-DC85C3D3569D}">
   <ds:schemaRefs>
     <ds:schemaRef ds:uri="http://schemas.microsoft.com/office/2006/metadata/contentType"/>
@@ -7018,23 +7046,6 @@
 </ds:datastoreItem>
 </file>
 
-<file path=customXml/itemProps2.xml><?xml version="1.0" encoding="utf-8"?>
-<ds:datastoreItem xmlns:ds="http://schemas.openxmlformats.org/officeDocument/2006/customXml" ds:itemID="{9DF1F198-947F-4E15-85D4-C4A2BF14403A}">
-  <ds:schemaRefs>
-    <ds:schemaRef ds:uri="http://schemas.microsoft.com/office/2006/metadata/properties"/>
-    <ds:schemaRef ds:uri="http://schemas.microsoft.com/office/infopath/2007/PartnerControls"/>
-  </ds:schemaRefs>
-</ds:datastoreItem>
-</file>
-
-<file path=customXml/itemProps3.xml><?xml version="1.0" encoding="utf-8"?>
-<ds:datastoreItem xmlns:ds="http://schemas.openxmlformats.org/officeDocument/2006/customXml" ds:itemID="{DC5743D9-90E8-4705-BD73-39E0AE4FDF6F}">
-  <ds:schemaRefs>
-    <ds:schemaRef ds:uri="http://schemas.microsoft.com/sharepoint/v3/contenttype/forms"/>
-  </ds:schemaRefs>
-</ds:datastoreItem>
-</file>
-
 <file path=customXml/itemProps4.xml><?xml version="1.0" encoding="utf-8"?>
 <ds:datastoreItem xmlns:ds="http://schemas.openxmlformats.org/officeDocument/2006/customXml" ds:itemID="{2EF541C5-2E96-4453-A2B9-57DE2C8172DB}">
   <ds:schemaRefs>

</xml_diff>

<commit_message>
Ajout de la capture d'ecran de l'historique final
</commit_message>
<xml_diff>
--- a/TP2-GSG_KR/TP 2 GIT H26.docx
+++ b/TP2-GSG_KR/TP 2 GIT H26.docx
@@ -2205,11 +2205,53 @@
           </w:p>
           <w:p>
             <w:pPr>
+              <w:jc w:val="center"/>
               <w:rPr>
                 <w:sz w:val="24"/>
                 <w:szCs w:val="24"/>
               </w:rPr>
             </w:pPr>
+            <w:r>
+              <w:rPr>
+                <w:sz w:val="24"/>
+                <w:szCs w:val="24"/>
+              </w:rPr>
+              <w:drawing>
+                <wp:inline distT="0" distB="0" distL="0" distR="0" wp14:anchorId="731AF352" wp14:editId="6BF57B2F">
+                  <wp:extent cx="4191585" cy="2076740"/>
+                  <wp:effectExtent l="0" t="0" r="0" b="0"/>
+                  <wp:docPr id="742544006" name="Image 1"/>
+                  <wp:cNvGraphicFramePr>
+                    <a:graphicFrameLocks xmlns:a="http://schemas.openxmlformats.org/drawingml/2006/main" noChangeAspect="1"/>
+                  </wp:cNvGraphicFramePr>
+                  <a:graphic xmlns:a="http://schemas.openxmlformats.org/drawingml/2006/main">
+                    <a:graphicData uri="http://schemas.openxmlformats.org/drawingml/2006/picture">
+                      <pic:pic xmlns:pic="http://schemas.openxmlformats.org/drawingml/2006/picture">
+                        <pic:nvPicPr>
+                          <pic:cNvPr id="742544006" name=""/>
+                          <pic:cNvPicPr/>
+                        </pic:nvPicPr>
+                        <pic:blipFill>
+                          <a:blip r:embed="rId12"/>
+                          <a:stretch>
+                            <a:fillRect/>
+                          </a:stretch>
+                        </pic:blipFill>
+                        <pic:spPr>
+                          <a:xfrm>
+                            <a:off x="0" y="0"/>
+                            <a:ext cx="4191585" cy="2076740"/>
+                          </a:xfrm>
+                          <a:prstGeom prst="rect">
+                            <a:avLst/>
+                          </a:prstGeom>
+                        </pic:spPr>
+                      </pic:pic>
+                    </a:graphicData>
+                  </a:graphic>
+                </wp:inline>
+              </w:drawing>
+            </w:r>
           </w:p>
           <w:p>
             <w:pPr>
@@ -2323,11 +2365,54 @@
           </w:p>
           <w:p>
             <w:pPr>
+              <w:jc w:val="center"/>
               <w:rPr>
                 <w:sz w:val="24"/>
                 <w:szCs w:val="24"/>
               </w:rPr>
             </w:pPr>
+            <w:r>
+              <w:rPr>
+                <w:sz w:val="24"/>
+                <w:szCs w:val="24"/>
+              </w:rPr>
+              <w:lastRenderedPageBreak/>
+              <w:drawing>
+                <wp:inline distT="0" distB="0" distL="0" distR="0" wp14:anchorId="1094A6E7" wp14:editId="31D3A95C">
+                  <wp:extent cx="6332220" cy="5224780"/>
+                  <wp:effectExtent l="0" t="0" r="0" b="0"/>
+                  <wp:docPr id="734564835" name="Image 1"/>
+                  <wp:cNvGraphicFramePr>
+                    <a:graphicFrameLocks xmlns:a="http://schemas.openxmlformats.org/drawingml/2006/main" noChangeAspect="1"/>
+                  </wp:cNvGraphicFramePr>
+                  <a:graphic xmlns:a="http://schemas.openxmlformats.org/drawingml/2006/main">
+                    <a:graphicData uri="http://schemas.openxmlformats.org/drawingml/2006/picture">
+                      <pic:pic xmlns:pic="http://schemas.openxmlformats.org/drawingml/2006/picture">
+                        <pic:nvPicPr>
+                          <pic:cNvPr id="734564835" name=""/>
+                          <pic:cNvPicPr/>
+                        </pic:nvPicPr>
+                        <pic:blipFill>
+                          <a:blip r:embed="rId13"/>
+                          <a:stretch>
+                            <a:fillRect/>
+                          </a:stretch>
+                        </pic:blipFill>
+                        <pic:spPr>
+                          <a:xfrm>
+                            <a:off x="0" y="0"/>
+                            <a:ext cx="6332220" cy="5224780"/>
+                          </a:xfrm>
+                          <a:prstGeom prst="rect">
+                            <a:avLst/>
+                          </a:prstGeom>
+                        </pic:spPr>
+                      </pic:pic>
+                    </a:graphicData>
+                  </a:graphic>
+                </wp:inline>
+              </w:drawing>
+            </w:r>
           </w:p>
           <w:p>
             <w:pPr>
@@ -2476,7 +2561,7 @@
       </w:r>
     </w:p>
     <w:sectPr>
-      <w:footerReference w:type="default" r:id="rId12"/>
+      <w:footerReference w:type="default" r:id="rId14"/>
       <w:pgSz w:w="12240" w:h="15840" w:code="1"/>
       <w:pgMar w:top="851" w:right="1134" w:bottom="851" w:left="1134" w:header="680" w:footer="680" w:gutter="0"/>
       <w:cols w:space="720"/>

</xml_diff>